<commit_message>
chore: update improvements file
</commit_message>
<xml_diff>
--- a/miscellaneous/bhAskarabhaTTa_unmattarAghava_improvements.docx
+++ b/miscellaneous/bhAskarabhaTTa_unmattarAghava_improvements.docx
@@ -2,6 +2,176 @@
 <file path=word/document.xml><?xml version="1.0" encoding="utf-8"?>
 <w:document xmlns:mc="http://schemas.openxmlformats.org/markup-compatibility/2006" xmlns:o="urn:schemas-microsoft-com:office:office" xmlns:r="http://schemas.openxmlformats.org/officeDocument/2006/relationships" xmlns:m="http://schemas.openxmlformats.org/officeDocument/2006/math" xmlns:v="urn:schemas-microsoft-com:vml" xmlns:wp="http://schemas.openxmlformats.org/drawingml/2006/wordprocessingDrawing" xmlns:w10="urn:schemas-microsoft-com:office:word" xmlns:w="http://schemas.openxmlformats.org/wordprocessingml/2006/main" xmlns:wne="http://schemas.microsoft.com/office/word/2006/wordml" xmlns:sl="http://schemas.openxmlformats.org/schemaLibrary/2006/main" xmlns:a="http://schemas.openxmlformats.org/drawingml/2006/main" xmlns:pic="http://schemas.openxmlformats.org/drawingml/2006/picture" xmlns:c="http://schemas.openxmlformats.org/drawingml/2006/chart" xmlns:lc="http://schemas.openxmlformats.org/drawingml/2006/lockedCanvas" xmlns:dgm="http://schemas.openxmlformats.org/drawingml/2006/diagram" xmlns:wps="http://schemas.microsoft.com/office/word/2010/wordprocessingShape" xmlns:wpg="http://schemas.microsoft.com/office/word/2010/wordprocessingGroup" xmlns:w14="http://schemas.microsoft.com/office/word/2010/wordml" xmlns:w15="http://schemas.microsoft.com/office/word/2012/wordml" xmlns:w16="http://schemas.microsoft.com/office/word/2018/wordml" xmlns:w16cex="http://schemas.microsoft.com/office/word/2018/wordml/cex" xmlns:w16cid="http://schemas.microsoft.com/office/word/2016/wordml/cid" xmlns="http://schemas.microsoft.com/office/tasks/2019/documenttasks" xmlns:cr="http://schemas.microsoft.com/office/comments/2020/reactions">
   <w:body>
+    <w:p>
+      <w:pPr>
+        <w:jc w:val="center"/>
+        <w:rPr>
+          <w:rFonts w:ascii="Castoro" w:cs="Castoro" w:eastAsia="Castoro" w:hAnsi="Castoro"/>
+          <w:b w:val="1"/>
+          <w:bCs w:val="1"/>
+          <w:sz w:val="24"/>
+          <w:szCs w:val="24"/>
+        </w:rPr>
+      </w:pPr>
+      <w:r>
+        <w:rPr>
+          <w:rFonts w:ascii="Castoro" w:cs="Castoro" w:eastAsia="Castoro" w:hAnsi="Castoro"/>
+          <w:b w:val="1"/>
+          <w:bCs w:val="1"/>
+          <w:sz w:val="24"/>
+          <w:szCs w:val="24"/>
+          <w:rtl w:val="0"/>
+        </w:rPr>
+        <w:t xml:space="preserve">List of Improvements to </w:t>
+      </w:r>
+      <w:r>
+        <w:rPr>
+          <w:rFonts w:ascii="Castoro" w:cs="Castoro" w:eastAsia="Castoro" w:hAnsi="Castoro"/>
+          <w:b w:val="1"/>
+          <w:bCs w:val="1"/>
+          <w:sz w:val="24"/>
+          <w:szCs w:val="24"/>
+          <w:highlight w:val="white"/>
+          <w:rtl w:val="0"/>
+        </w:rPr>
+        <w:t xml:space="preserve">the 1899 Edition of </w:t>
+      </w:r>
+      <w:r>
+        <w:rPr>
+          <w:rFonts w:ascii="Castoro" w:cs="Castoro" w:eastAsia="Castoro" w:hAnsi="Castoro"/>
+          <w:b w:val="1"/>
+          <w:bCs w:val="1"/>
+          <w:sz w:val="24"/>
+          <w:szCs w:val="24"/>
+          <w:rtl w:val="0"/>
+        </w:rPr>
+        <w:t xml:space="preserve">Bhāskara Bhaṭṭa’s </w:t>
+      </w:r>
+      <w:r>
+        <w:rPr>
+          <w:rFonts w:ascii="Castoro" w:cs="Castoro" w:eastAsia="Castoro" w:hAnsi="Castoro"/>
+          <w:b w:val="1"/>
+          <w:bCs w:val="1"/>
+          <w:i w:val="1"/>
+          <w:iCs w:val="1"/>
+          <w:sz w:val="24"/>
+          <w:szCs w:val="24"/>
+          <w:rtl w:val="0"/>
+        </w:rPr>
+        <w:t xml:space="preserve">Unmattarāghava</w:t>
+      </w:r>
+      <w:r>
+        <w:rPr>
+          <w:rtl w:val="0"/>
+        </w:rPr>
+      </w:r>
+    </w:p>
+    <w:p>
+      <w:pPr>
+        <w:jc w:val="center"/>
+        <w:rPr>
+          <w:rFonts w:ascii="Tiro Devanagari Sanskrit" w:cs="Tiro Devanagari Sanskrit" w:eastAsia="Tiro Devanagari Sanskrit" w:hAnsi="Tiro Devanagari Sanskrit"/>
+          <w:i w:val="1"/>
+          <w:iCs w:val="1"/>
+          <w:sz w:val="24"/>
+          <w:szCs w:val="24"/>
+        </w:rPr>
+      </w:pPr>
+      <w:r>
+        <w:rPr>
+          <w:rFonts w:ascii="Castoro" w:cs="Castoro" w:eastAsia="Castoro" w:hAnsi="Castoro"/>
+          <w:b w:val="1"/>
+          <w:bCs w:val="1"/>
+          <w:sz w:val="24"/>
+          <w:szCs w:val="24"/>
+          <w:rtl w:val="0"/>
+        </w:rPr>
+        <w:t xml:space="preserve">Based on </w:t>
+      </w:r>
+      <w:hyperlink r:id="rId7">
+        <w:r>
+          <w:rPr>
+            <w:rFonts w:ascii="Castoro" w:cs="Castoro" w:eastAsia="Castoro" w:hAnsi="Castoro"/>
+            <w:b w:val="1"/>
+            <w:bCs w:val="1"/>
+            <w:color w:val="1155cc"/>
+            <w:sz w:val="24"/>
+            <w:szCs w:val="24"/>
+            <w:u w:val="single"/>
+            <w:rtl w:val="0"/>
+          </w:rPr>
+          <w:t xml:space="preserve">SUB Hamburg Cod. Palmbl. I 81 (35.3081)</w:t>
+        </w:r>
+      </w:hyperlink>
+      <w:r>
+        <w:rPr>
+          <w:rFonts w:ascii="Tiro Devanagari Sanskrit" w:cs="Tiro Devanagari Sanskrit" w:eastAsia="Tiro Devanagari Sanskrit" w:hAnsi="Tiro Devanagari Sanskrit"/>
+          <w:sz w:val="24"/>
+          <w:szCs w:val="24"/>
+          <w:vertAlign w:val="superscript"/>
+        </w:rPr>
+        <w:footnoteReference w:customMarkFollows="0" w:id="0"/>
+      </w:r>
+      <w:r>
+        <w:rPr>
+          <w:rtl w:val="0"/>
+        </w:rPr>
+      </w:r>
+    </w:p>
+    <w:p>
+      <w:pPr>
+        <w:jc w:val="center"/>
+        <w:rPr>
+          <w:rFonts w:ascii="Tiro Devanagari Sanskrit" w:cs="Tiro Devanagari Sanskrit" w:eastAsia="Tiro Devanagari Sanskrit" w:hAnsi="Tiro Devanagari Sanskrit"/>
+          <w:i w:val="1"/>
+          <w:iCs w:val="1"/>
+          <w:sz w:val="24"/>
+          <w:szCs w:val="24"/>
+        </w:rPr>
+      </w:pPr>
+      <w:r>
+        <w:rPr>
+          <w:rtl w:val="0"/>
+        </w:rPr>
+      </w:r>
+    </w:p>
+    <w:p>
+      <w:pPr>
+        <w:jc w:val="center"/>
+        <w:rPr>
+          <w:rFonts w:ascii="Tiro Devanagari Sanskrit" w:cs="Tiro Devanagari Sanskrit" w:eastAsia="Tiro Devanagari Sanskrit" w:hAnsi="Tiro Devanagari Sanskrit"/>
+          <w:i w:val="1"/>
+          <w:iCs w:val="1"/>
+          <w:sz w:val="24"/>
+          <w:szCs w:val="24"/>
+        </w:rPr>
+      </w:pPr>
+      <w:r>
+        <w:rPr>
+          <w:rFonts w:ascii="Tiro Devanagari Sanskrit" w:cs="Tiro Devanagari Sanskrit" w:eastAsia="Tiro Devanagari Sanskrit" w:hAnsi="Tiro Devanagari Sanskrit"/>
+          <w:i w:val="1"/>
+          <w:iCs w:val="1"/>
+          <w:sz w:val="24"/>
+          <w:szCs w:val="24"/>
+          <w:rtl w:val="0"/>
+        </w:rPr>
+        <w:t xml:space="preserve">[Last updated by T. Richard on July 16th, 2026]</w:t>
+      </w:r>
+    </w:p>
+    <w:p>
+      <w:pPr>
+        <w:rPr>
+          <w:rFonts w:ascii="Tiro Devanagari Sanskrit" w:cs="Tiro Devanagari Sanskrit" w:eastAsia="Tiro Devanagari Sanskrit" w:hAnsi="Tiro Devanagari Sanskrit"/>
+          <w:sz w:val="24"/>
+          <w:szCs w:val="24"/>
+        </w:rPr>
+      </w:pPr>
+      <w:r>
+        <w:rPr>
+          <w:rtl w:val="0"/>
+        </w:rPr>
+      </w:r>
+    </w:p>
     <w:p>
       <w:pPr>
         <w:numPr>
@@ -22,7 +192,7 @@
           <w:szCs w:val="24"/>
           <w:rtl w:val="0"/>
         </w:rPr>
-        <w:t xml:space="preserve">In Verse 8, the Berlin manuscript reads </w:t>
+        <w:t xml:space="preserve">In Verse 8, the Hamburg manuscript reads </w:t>
       </w:r>
       <w:r>
         <w:rPr>
@@ -104,7 +274,7 @@
           <w:szCs w:val="24"/>
           <w:rtl w:val="0"/>
         </w:rPr>
-        <w:t xml:space="preserve">Between Verses 27 and 28, the Berlin manuscript reads </w:t>
+        <w:t xml:space="preserve">On Page 11, Lines 23-24, the Hamburg manuscript reads </w:t>
       </w:r>
       <w:r>
         <w:rPr>
@@ -153,7 +323,7 @@
           <w:szCs w:val="24"/>
           <w:rtl w:val="0"/>
         </w:rPr>
-        <w:t xml:space="preserve">(“she burns”) that the editors of the Kāvyamāla edition were doubtful about.</w:t>
+        <w:t xml:space="preserve">(“burning”) that the editors of the Kāvyamāla edition were doubtful about.</w:t>
       </w:r>
     </w:p>
     <w:p>
@@ -190,7 +360,7 @@
           <w:szCs w:val="24"/>
           <w:rtl w:val="0"/>
         </w:rPr>
-        <w:t xml:space="preserve">After Verse 29, the Berlin manuscript reads </w:t>
+        <w:t xml:space="preserve">On Page 12, Line 1 as well as on Page 13, Line 19, the Hamburg manuscript includes the stage direction </w:t>
       </w:r>
       <w:r>
         <w:rPr>
@@ -201,36 +371,16 @@
           <w:szCs w:val="24"/>
           <w:rtl w:val="0"/>
         </w:rPr>
-        <w:t xml:space="preserve">bhāvayatv āryaḥ</w:t>
-      </w:r>
-      <w:r>
-        <w:rPr>
-          <w:rFonts w:ascii="Tiro Devanagari Sanskrit" w:cs="Tiro Devanagari Sanskrit" w:eastAsia="Tiro Devanagari Sanskrit" w:hAnsi="Tiro Devanagari Sanskrit"/>
-          <w:sz w:val="24"/>
-          <w:szCs w:val="24"/>
-          <w:rtl w:val="0"/>
-        </w:rPr>
-        <w:t xml:space="preserve"> (“take a closer look, brother”), which improves upon the original reading </w:t>
-      </w:r>
-      <w:r>
-        <w:rPr>
-          <w:rFonts w:ascii="Tiro Devanagari Sanskrit" w:cs="Tiro Devanagari Sanskrit" w:eastAsia="Tiro Devanagari Sanskrit" w:hAnsi="Tiro Devanagari Sanskrit"/>
-          <w:i w:val="1"/>
-          <w:iCs w:val="1"/>
-          <w:sz w:val="24"/>
-          <w:szCs w:val="24"/>
-          <w:rtl w:val="0"/>
-        </w:rPr>
-        <w:t xml:space="preserve">vibhāvayaty āryaḥ </w:t>
-      </w:r>
-      <w:r>
-        <w:rPr>
-          <w:rFonts w:ascii="Tiro Devanagari Sanskrit" w:cs="Tiro Devanagari Sanskrit" w:eastAsia="Tiro Devanagari Sanskrit" w:hAnsi="Tiro Devanagari Sanskrit"/>
-          <w:sz w:val="24"/>
-          <w:szCs w:val="24"/>
-          <w:rtl w:val="0"/>
-        </w:rPr>
-        <w:t xml:space="preserve">(“brother takes a closer look”) by replacing the strange present indicative verb with a more contextually appropriate polite, third-person imperative one.</w:t>
+        <w:t xml:space="preserve">svagatam</w:t>
+      </w:r>
+      <w:r>
+        <w:rPr>
+          <w:rFonts w:ascii="Tiro Devanagari Sanskrit" w:cs="Tiro Devanagari Sanskrit" w:eastAsia="Tiro Devanagari Sanskrit" w:hAnsi="Tiro Devanagari Sanskrit"/>
+          <w:sz w:val="24"/>
+          <w:szCs w:val="24"/>
+          <w:rtl w:val="0"/>
+        </w:rPr>
+        <w:t xml:space="preserve"> (“aside”), which follows the pattern set by Lakṣmaṇa’s other quiet laments over his brother’s unhinged state.</w:t>
       </w:r>
     </w:p>
     <w:p>
@@ -267,7 +417,25 @@
           <w:szCs w:val="24"/>
           <w:rtl w:val="0"/>
         </w:rPr>
-        <w:t xml:space="preserve">After Verses 31 and 38, the Berlin manuscript includes the stage direction </w:t>
+        <w:t xml:space="preserve">On</w:t>
+      </w:r>
+      <w:r>
+        <w:rPr>
+          <w:rFonts w:ascii="Tiro Devanagari Sanskrit" w:cs="Tiro Devanagari Sanskrit" w:eastAsia="Tiro Devanagari Sanskrit" w:hAnsi="Tiro Devanagari Sanskrit"/>
+          <w:sz w:val="24"/>
+          <w:szCs w:val="24"/>
+          <w:rtl w:val="0"/>
+        </w:rPr>
+        <w:t xml:space="preserve"> Page 14, Line 22,</w:t>
+      </w:r>
+      <w:r>
+        <w:rPr>
+          <w:rFonts w:ascii="Tiro Devanagari Sanskrit" w:cs="Tiro Devanagari Sanskrit" w:eastAsia="Tiro Devanagari Sanskrit" w:hAnsi="Tiro Devanagari Sanskrit"/>
+          <w:sz w:val="24"/>
+          <w:szCs w:val="24"/>
+          <w:rtl w:val="0"/>
+        </w:rPr>
+        <w:t xml:space="preserve"> the Hamburg manuscript includes the helpful stage direction </w:t>
       </w:r>
       <w:r>
         <w:rPr>
@@ -278,16 +446,16 @@
           <w:szCs w:val="24"/>
           <w:rtl w:val="0"/>
         </w:rPr>
-        <w:t xml:space="preserve">svagatam</w:t>
-      </w:r>
-      <w:r>
-        <w:rPr>
-          <w:rFonts w:ascii="Tiro Devanagari Sanskrit" w:cs="Tiro Devanagari Sanskrit" w:eastAsia="Tiro Devanagari Sanskrit" w:hAnsi="Tiro Devanagari Sanskrit"/>
-          <w:sz w:val="24"/>
-          <w:szCs w:val="24"/>
-          <w:rtl w:val="0"/>
-        </w:rPr>
-        <w:t xml:space="preserve"> (“aside”), which follows the pattern set by Lakṣmaṇa’s other quiet laments over his brother’s unhinged state.</w:t>
+        <w:t xml:space="preserve">upasṛtya</w:t>
+      </w:r>
+      <w:r>
+        <w:rPr>
+          <w:rFonts w:ascii="Tiro Devanagari Sanskrit" w:cs="Tiro Devanagari Sanskrit" w:eastAsia="Tiro Devanagari Sanskrit" w:hAnsi="Tiro Devanagari Sanskrit"/>
+          <w:sz w:val="24"/>
+          <w:szCs w:val="24"/>
+          <w:rtl w:val="0"/>
+        </w:rPr>
+        <w:t xml:space="preserve"> (“approaching”) not present in the printed edition.</w:t>
       </w:r>
     </w:p>
     <w:p>
@@ -324,7 +492,25 @@
           <w:szCs w:val="24"/>
           <w:rtl w:val="0"/>
         </w:rPr>
-        <w:t xml:space="preserve">On Page 36, the Berlin manuscript includes the helpful stage direction </w:t>
+        <w:t xml:space="preserve">On </w:t>
+      </w:r>
+      <w:r>
+        <w:rPr>
+          <w:rFonts w:ascii="Tiro Devanagari Sanskrit" w:cs="Tiro Devanagari Sanskrit" w:eastAsia="Tiro Devanagari Sanskrit" w:hAnsi="Tiro Devanagari Sanskrit"/>
+          <w:sz w:val="24"/>
+          <w:szCs w:val="24"/>
+          <w:rtl w:val="0"/>
+        </w:rPr>
+        <w:t xml:space="preserve">Page 15, Line </w:t>
+      </w:r>
+      <w:r>
+        <w:rPr>
+          <w:rFonts w:ascii="Tiro Devanagari Sanskrit" w:cs="Tiro Devanagari Sanskrit" w:eastAsia="Tiro Devanagari Sanskrit" w:hAnsi="Tiro Devanagari Sanskrit"/>
+          <w:sz w:val="24"/>
+          <w:szCs w:val="24"/>
+          <w:rtl w:val="0"/>
+        </w:rPr>
+        <w:t xml:space="preserve">5, the Hamburg manuscript contains the stage direction </w:t>
       </w:r>
       <w:r>
         <w:rPr>
@@ -335,16 +521,16 @@
           <w:szCs w:val="24"/>
           <w:rtl w:val="0"/>
         </w:rPr>
-        <w:t xml:space="preserve">upasṛtya</w:t>
-      </w:r>
-      <w:r>
-        <w:rPr>
-          <w:rFonts w:ascii="Tiro Devanagari Sanskrit" w:cs="Tiro Devanagari Sanskrit" w:eastAsia="Tiro Devanagari Sanskrit" w:hAnsi="Tiro Devanagari Sanskrit"/>
-          <w:sz w:val="24"/>
-          <w:szCs w:val="24"/>
-          <w:rtl w:val="0"/>
-        </w:rPr>
-        <w:t xml:space="preserve"> (“approaching”) not present in the printed edition.</w:t>
+        <w:t xml:space="preserve">tatheti sarve upaviśanti</w:t>
+      </w:r>
+      <w:r>
+        <w:rPr>
+          <w:rFonts w:ascii="Tiro Devanagari Sanskrit" w:cs="Tiro Devanagari Sanskrit" w:eastAsia="Tiro Devanagari Sanskrit" w:hAnsi="Tiro Devanagari Sanskrit"/>
+          <w:sz w:val="24"/>
+          <w:szCs w:val="24"/>
+          <w:rtl w:val="0"/>
+        </w:rPr>
+        <w:t xml:space="preserve"> (“They all agree and take a seat.”), resolving the strangely univocal reply found in the printed edition.</w:t>
       </w:r>
     </w:p>
     <w:p>
@@ -381,7 +567,25 @@
           <w:szCs w:val="24"/>
           <w:rtl w:val="0"/>
         </w:rPr>
-        <w:t xml:space="preserve">On Page 37, the Berlin manuscript contains the stage direction </w:t>
+        <w:t xml:space="preserve">On </w:t>
+      </w:r>
+      <w:r>
+        <w:rPr>
+          <w:rFonts w:ascii="Tiro Devanagari Sanskrit" w:cs="Tiro Devanagari Sanskrit" w:eastAsia="Tiro Devanagari Sanskrit" w:hAnsi="Tiro Devanagari Sanskrit"/>
+          <w:sz w:val="24"/>
+          <w:szCs w:val="24"/>
+          <w:rtl w:val="0"/>
+        </w:rPr>
+        <w:t xml:space="preserve">Page 15, Line</w:t>
+      </w:r>
+      <w:r>
+        <w:rPr>
+          <w:rFonts w:ascii="Tiro Devanagari Sanskrit" w:cs="Tiro Devanagari Sanskrit" w:eastAsia="Tiro Devanagari Sanskrit" w:hAnsi="Tiro Devanagari Sanskrit"/>
+          <w:sz w:val="24"/>
+          <w:szCs w:val="24"/>
+          <w:rtl w:val="0"/>
+        </w:rPr>
+        <w:t xml:space="preserve"> 23, the Hamburg manuscript reads </w:t>
       </w:r>
       <w:r>
         <w:rPr>
@@ -392,53 +596,16 @@
           <w:szCs w:val="24"/>
           <w:rtl w:val="0"/>
         </w:rPr>
-        <w:t xml:space="preserve">tatheti sarve upaviśanti</w:t>
-      </w:r>
-      <w:r>
-        <w:rPr>
-          <w:rFonts w:ascii="Tiro Devanagari Sanskrit" w:cs="Tiro Devanagari Sanskrit" w:eastAsia="Tiro Devanagari Sanskrit" w:hAnsi="Tiro Devanagari Sanskrit"/>
-          <w:sz w:val="24"/>
-          <w:szCs w:val="24"/>
-          <w:rtl w:val="0"/>
-        </w:rPr>
-        <w:t xml:space="preserve"> (“They all agree and take a seat.”), resolving the strange univocal reply found in the printed edition.</w:t>
-      </w:r>
-    </w:p>
-    <w:p>
-      <w:pPr>
-        <w:rPr>
-          <w:rFonts w:ascii="Tiro Devanagari Sanskrit" w:cs="Tiro Devanagari Sanskrit" w:eastAsia="Tiro Devanagari Sanskrit" w:hAnsi="Tiro Devanagari Sanskrit"/>
-          <w:sz w:val="24"/>
-          <w:szCs w:val="24"/>
-        </w:rPr>
-      </w:pPr>
-      <w:r>
-        <w:rPr>
-          <w:rtl w:val="0"/>
-        </w:rPr>
-      </w:r>
-    </w:p>
-    <w:p>
-      <w:pPr>
-        <w:numPr>
-          <w:ilvl w:val="0"/>
-          <w:numId w:val="1"/>
-        </w:numPr>
-        <w:ind w:left="720" w:hanging="360"/>
-        <w:rPr>
-          <w:rFonts w:ascii="Tiro Devanagari Sanskrit" w:cs="Tiro Devanagari Sanskrit" w:eastAsia="Tiro Devanagari Sanskrit" w:hAnsi="Tiro Devanagari Sanskrit"/>
-          <w:sz w:val="24"/>
-          <w:szCs w:val="24"/>
-        </w:rPr>
-      </w:pPr>
-      <w:r>
-        <w:rPr>
-          <w:rFonts w:ascii="Tiro Devanagari Sanskrit" w:cs="Tiro Devanagari Sanskrit" w:eastAsia="Tiro Devanagari Sanskrit" w:hAnsi="Tiro Devanagari Sanskrit"/>
-          <w:sz w:val="24"/>
-          <w:szCs w:val="24"/>
-          <w:rtl w:val="0"/>
-        </w:rPr>
-        <w:t xml:space="preserve">On Page 39, the Berlin manuscript reads </w:t>
+        <w:t xml:space="preserve">tasmin vane cāsyāḥ pratyasattir āsīt</w:t>
+      </w:r>
+      <w:r>
+        <w:rPr>
+          <w:rFonts w:ascii="Tiro Devanagari Sanskrit" w:cs="Tiro Devanagari Sanskrit" w:eastAsia="Tiro Devanagari Sanskrit" w:hAnsi="Tiro Devanagari Sanskrit"/>
+          <w:sz w:val="24"/>
+          <w:szCs w:val="24"/>
+          <w:rtl w:val="0"/>
+        </w:rPr>
+        <w:t xml:space="preserve"> (“From then on, she remained connected to this forest”) which is slightly preferable to original reading </w:t>
       </w:r>
       <w:r>
         <w:rPr>
@@ -449,26 +616,6 @@
           <w:szCs w:val="24"/>
           <w:rtl w:val="0"/>
         </w:rPr>
-        <w:t xml:space="preserve">tasmin vane cāsyāḥ pratyasattir āsīt</w:t>
-      </w:r>
-      <w:r>
-        <w:rPr>
-          <w:rFonts w:ascii="Tiro Devanagari Sanskrit" w:cs="Tiro Devanagari Sanskrit" w:eastAsia="Tiro Devanagari Sanskrit" w:hAnsi="Tiro Devanagari Sanskrit"/>
-          <w:sz w:val="24"/>
-          <w:szCs w:val="24"/>
-          <w:rtl w:val="0"/>
-        </w:rPr>
-        <w:t xml:space="preserve"> (“From then on, she remained connected to this forest”) which is slightly preferable to original reading </w:t>
-      </w:r>
-      <w:r>
-        <w:rPr>
-          <w:rFonts w:ascii="Tiro Devanagari Sanskrit" w:cs="Tiro Devanagari Sanskrit" w:eastAsia="Tiro Devanagari Sanskrit" w:hAnsi="Tiro Devanagari Sanskrit"/>
-          <w:i w:val="1"/>
-          <w:iCs w:val="1"/>
-          <w:sz w:val="24"/>
-          <w:szCs w:val="24"/>
-          <w:rtl w:val="0"/>
-        </w:rPr>
         <w:t xml:space="preserve">tasmin vane nāsyāḥ pratyasattir āsīt </w:t>
       </w:r>
       <w:r>
@@ -487,38 +634,83 @@
       </w:r>
     </w:p>
     <w:sectPr>
-      <w:headerReference r:id="rId6" w:type="default"/>
+      <w:headerReference r:id="rId8" w:type="default"/>
+      <w:footerReference r:id="rId9" w:type="default"/>
       <w:pgSz w:h="15840" w:w="12240" w:orient="portrait"/>
-      <w:pgMar w:bottom="1440" w:top="1440" w:left="1440" w:right="1440" w:header="720" w:footer="720"/>
+      <w:pgMar w:bottom="1440" w:top="0" w:left="1440" w:right="1440" w:header="720" w:footer="720"/>
       <w:pgNumType w:start="1"/>
     </w:sectPr>
   </w:body>
 </w:document>
 </file>
 
+<file path=word/footer1.xml><?xml version="1.0" encoding="utf-8"?>
+<w:ftr xmlns:mc="http://schemas.openxmlformats.org/markup-compatibility/2006" xmlns:o="urn:schemas-microsoft-com:office:office" xmlns:r="http://schemas.openxmlformats.org/officeDocument/2006/relationships" xmlns:m="http://schemas.openxmlformats.org/officeDocument/2006/math" xmlns:v="urn:schemas-microsoft-com:vml" xmlns:wp="http://schemas.openxmlformats.org/drawingml/2006/wordprocessingDrawing" xmlns:w10="urn:schemas-microsoft-com:office:word" xmlns:w="http://schemas.openxmlformats.org/wordprocessingml/2006/main" xmlns:wne="http://schemas.microsoft.com/office/word/2006/wordml" xmlns:sl="http://schemas.openxmlformats.org/schemaLibrary/2006/main" xmlns:a="http://schemas.openxmlformats.org/drawingml/2006/main" xmlns:pic="http://schemas.openxmlformats.org/drawingml/2006/picture" xmlns:c="http://schemas.openxmlformats.org/drawingml/2006/chart" xmlns:lc="http://schemas.openxmlformats.org/drawingml/2006/lockedCanvas" xmlns:dgm="http://schemas.openxmlformats.org/drawingml/2006/diagram" xmlns:wps="http://schemas.microsoft.com/office/word/2010/wordprocessingShape" xmlns:wpg="http://schemas.microsoft.com/office/word/2010/wordprocessingGroup" xmlns:w14="http://schemas.microsoft.com/office/word/2010/wordml" xmlns:w15="http://schemas.microsoft.com/office/word/2012/wordml" xmlns:w16="http://schemas.microsoft.com/office/word/2018/wordml" xmlns:w16cex="http://schemas.microsoft.com/office/word/2018/wordml/cex" xmlns:w16cid="http://schemas.microsoft.com/office/word/2016/wordml/cid" xmlns="http://schemas.microsoft.com/office/tasks/2019/documenttasks" xmlns:cr="http://schemas.microsoft.com/office/comments/2020/reactions">
+  <w:p>
+    <w:pPr>
+      <w:rPr/>
+    </w:pPr>
+    <w:r>
+      <w:rPr>
+        <w:rtl w:val="0"/>
+      </w:rPr>
+    </w:r>
+  </w:p>
+</w:ftr>
+</file>
+
+<file path=word/footnotes.xml><?xml version="1.0" encoding="utf-8"?>
+<w:footnotes xmlns:mc="http://schemas.openxmlformats.org/markup-compatibility/2006" xmlns:o="urn:schemas-microsoft-com:office:office" xmlns:r="http://schemas.openxmlformats.org/officeDocument/2006/relationships" xmlns:m="http://schemas.openxmlformats.org/officeDocument/2006/math" xmlns:v="urn:schemas-microsoft-com:vml" xmlns:wp="http://schemas.openxmlformats.org/drawingml/2006/wordprocessingDrawing" xmlns:w10="urn:schemas-microsoft-com:office:word" xmlns:w="http://schemas.openxmlformats.org/wordprocessingml/2006/main" xmlns:wne="http://schemas.microsoft.com/office/word/2006/wordml" xmlns:sl="http://schemas.openxmlformats.org/schemaLibrary/2006/main" xmlns:a="http://schemas.openxmlformats.org/drawingml/2006/main" xmlns:pic="http://schemas.openxmlformats.org/drawingml/2006/picture" xmlns:c="http://schemas.openxmlformats.org/drawingml/2006/chart" xmlns:lc="http://schemas.openxmlformats.org/drawingml/2006/lockedCanvas" xmlns:dgm="http://schemas.openxmlformats.org/drawingml/2006/diagram" xmlns:wps="http://schemas.microsoft.com/office/word/2010/wordprocessingShape" xmlns:wpg="http://schemas.microsoft.com/office/word/2010/wordprocessingGroup" xmlns:w14="http://schemas.microsoft.com/office/word/2010/wordml" xmlns:w15="http://schemas.microsoft.com/office/word/2012/wordml" xmlns:w16="http://schemas.microsoft.com/office/word/2018/wordml" xmlns:w16cex="http://schemas.microsoft.com/office/word/2018/wordml/cex" xmlns:w16cid="http://schemas.microsoft.com/office/word/2016/wordml/cid" xmlns="http://schemas.microsoft.com/office/tasks/2019/documenttasks" xmlns:cr="http://schemas.microsoft.com/office/comments/2020/reactions">
+  <w:footnote w:id="0">
+    <w:p>
+      <w:pPr>
+        <w:spacing w:line="240" w:lineRule="auto"/>
+        <w:rPr>
+          <w:rFonts w:ascii="Castoro" w:cs="Castoro" w:eastAsia="Castoro" w:hAnsi="Castoro"/>
+          <w:sz w:val="20"/>
+          <w:szCs w:val="20"/>
+        </w:rPr>
+      </w:pPr>
+      <w:r>
+        <w:rPr>
+          <w:rStyle w:val="FootnoteReference"/>
+          <w:vertAlign w:val="superscript"/>
+        </w:rPr>
+        <w:footnoteRef/>
+      </w:r>
+      <w:r>
+        <w:rPr>
+          <w:rFonts w:ascii="Castoro" w:cs="Castoro" w:eastAsia="Castoro" w:hAnsi="Castoro"/>
+          <w:sz w:val="20"/>
+          <w:szCs w:val="20"/>
+          <w:rtl w:val="0"/>
+        </w:rPr>
+        <w:t xml:space="preserve"> My primary reason for consulting this particular manuscript was one of convenience, as high-quality photographs of it are readily available online through the Universität Hamburg. A cursory search of the National Mission for Manuscripts reveals the existence of seventeen other manuscripts bearing the same title and author, written in a variety of scripts and located in archives across Tamil Nadu, Karnataka, and Uttar Pradesh.</w:t>
+      </w:r>
+    </w:p>
+  </w:footnote>
+</w:footnotes>
+</file>
+
 <file path=word/header1.xml><?xml version="1.0" encoding="utf-8"?>
 <w:hdr xmlns:mc="http://schemas.openxmlformats.org/markup-compatibility/2006" xmlns:o="urn:schemas-microsoft-com:office:office" xmlns:r="http://schemas.openxmlformats.org/officeDocument/2006/relationships" xmlns:m="http://schemas.openxmlformats.org/officeDocument/2006/math" xmlns:v="urn:schemas-microsoft-com:vml" xmlns:wp="http://schemas.openxmlformats.org/drawingml/2006/wordprocessingDrawing" xmlns:w10="urn:schemas-microsoft-com:office:word" xmlns:w="http://schemas.openxmlformats.org/wordprocessingml/2006/main" xmlns:wne="http://schemas.microsoft.com/office/word/2006/wordml" xmlns:sl="http://schemas.openxmlformats.org/schemaLibrary/2006/main" xmlns:a="http://schemas.openxmlformats.org/drawingml/2006/main" xmlns:pic="http://schemas.openxmlformats.org/drawingml/2006/picture" xmlns:c="http://schemas.openxmlformats.org/drawingml/2006/chart" xmlns:lc="http://schemas.openxmlformats.org/drawingml/2006/lockedCanvas" xmlns:dgm="http://schemas.openxmlformats.org/drawingml/2006/diagram" xmlns:wps="http://schemas.microsoft.com/office/word/2010/wordprocessingShape" xmlns:wpg="http://schemas.microsoft.com/office/word/2010/wordprocessingGroup" xmlns:w14="http://schemas.microsoft.com/office/word/2010/wordml" xmlns:w15="http://schemas.microsoft.com/office/word/2012/wordml" xmlns:w16="http://schemas.microsoft.com/office/word/2018/wordml" xmlns:w16cex="http://schemas.microsoft.com/office/word/2018/wordml/cex" xmlns:w16cid="http://schemas.microsoft.com/office/word/2016/wordml/cid" xmlns="http://schemas.microsoft.com/office/tasks/2019/documenttasks" xmlns:cr="http://schemas.microsoft.com/office/comments/2020/reactions">
   <w:p>
     <w:pPr>
-      <w:jc w:val="center"/>
+      <w:jc w:val="left"/>
       <w:rPr>
-        <w:rFonts w:ascii="Tiro Devanagari Sanskrit" w:cs="Tiro Devanagari Sanskrit" w:eastAsia="Tiro Devanagari Sanskrit" w:hAnsi="Tiro Devanagari Sanskrit"/>
+        <w:rFonts w:ascii="Castoro" w:cs="Castoro" w:eastAsia="Castoro" w:hAnsi="Castoro"/>
         <w:b w:val="1"/>
         <w:bCs w:val="1"/>
+        <w:i w:val="1"/>
+        <w:iCs w:val="1"/>
         <w:sz w:val="24"/>
         <w:szCs w:val="24"/>
       </w:rPr>
     </w:pPr>
     <w:r>
       <w:rPr>
-        <w:rFonts w:ascii="Tiro Devanagari Sanskrit" w:cs="Tiro Devanagari Sanskrit" w:eastAsia="Tiro Devanagari Sanskrit" w:hAnsi="Tiro Devanagari Sanskrit"/>
-        <w:b w:val="1"/>
-        <w:bCs w:val="1"/>
-        <w:sz w:val="24"/>
-        <w:szCs w:val="24"/>
         <w:rtl w:val="0"/>
       </w:rPr>
-      <w:t xml:space="preserve">List of Improvements from Berlin Manuscript</w:t>
     </w:r>
   </w:p>
 </w:hdr>

</xml_diff>

<commit_message>
chore: refresh improvements doc, add last one, regen
</commit_message>
<xml_diff>
--- a/miscellaneous/bhAskarabhaTTa_unmattarAghava_improvements.docx
+++ b/miscellaneous/bhAskarabhaTTa_unmattarAghava_improvements.docx
@@ -510,7 +510,47 @@
           <w:szCs w:val="24"/>
           <w:rtl w:val="0"/>
         </w:rPr>
-        <w:t xml:space="preserve">5, the Hamburg manuscript contains the stage direction </w:t>
+        <w:t xml:space="preserve">5, the Hamburg manuscript replaces the original reading </w:t>
+      </w:r>
+      <w:r>
+        <w:rPr>
+          <w:rFonts w:ascii="Tiro Devanagari Sanskrit" w:cs="Tiro Devanagari Sanskrit" w:eastAsia="Tiro Devanagari Sanskrit" w:hAnsi="Tiro Devanagari Sanskrit"/>
+          <w:i w:val="1"/>
+          <w:iCs w:val="1"/>
+          <w:sz w:val="24"/>
+          <w:szCs w:val="24"/>
+          <w:rtl w:val="0"/>
+        </w:rPr>
+        <w:t xml:space="preserve">sarve — tatha </w:t>
+      </w:r>
+      <w:r>
+        <w:rPr>
+          <w:rFonts w:ascii="Tiro Devanagari Sanskrit" w:cs="Tiro Devanagari Sanskrit" w:eastAsia="Tiro Devanagari Sanskrit" w:hAnsi="Tiro Devanagari Sanskrit"/>
+          <w:sz w:val="24"/>
+          <w:szCs w:val="24"/>
+          <w:rtl w:val="0"/>
+        </w:rPr>
+        <w:t xml:space="preserve">(</w:t>
+      </w:r>
+      <w:r>
+        <w:rPr>
+          <w:rFonts w:ascii="Tiro Devanagari Sanskrit" w:cs="Tiro Devanagari Sanskrit" w:eastAsia="Tiro Devanagari Sanskrit" w:hAnsi="Tiro Devanagari Sanskrit"/>
+          <w:i w:val="1"/>
+          <w:iCs w:val="1"/>
+          <w:sz w:val="24"/>
+          <w:szCs w:val="24"/>
+          <w:rtl w:val="0"/>
+        </w:rPr>
+        <w:t xml:space="preserve">ityupaviśanti</w:t>
+      </w:r>
+      <w:r>
+        <w:rPr>
+          <w:rFonts w:ascii="Tiro Devanagari Sanskrit" w:cs="Tiro Devanagari Sanskrit" w:eastAsia="Tiro Devanagari Sanskrit" w:hAnsi="Tiro Devanagari Sanskrit"/>
+          <w:sz w:val="24"/>
+          <w:szCs w:val="24"/>
+          <w:rtl w:val="0"/>
+        </w:rPr>
+        <w:t xml:space="preserve">) with the simple stage direction </w:t>
       </w:r>
       <w:r>
         <w:rPr>
@@ -530,7 +570,12 @@
           <w:szCs w:val="24"/>
           <w:rtl w:val="0"/>
         </w:rPr>
-        <w:t xml:space="preserve"> (“They all agree and take a seat.”), resolving the strangely univocal reply found in the printed edition.</w:t>
+        <w:t xml:space="preserve"> (“They all agree and take a seat.”), eliminating the strangely univocal piece of dialogue found in the printed edition.</w:t>
+      </w:r>
+      <w:r>
+        <w:rPr>
+          <w:rtl w:val="0"/>
+        </w:rPr>
       </w:r>
     </w:p>
     <w:p>
@@ -596,7 +641,29 @@
           <w:szCs w:val="24"/>
           <w:rtl w:val="0"/>
         </w:rPr>
-        <w:t xml:space="preserve">tasmin vane cāsyāḥ pratyasattir āsīt</w:t>
+        <w:t xml:space="preserve">tasmin vane cāsyāḥ </w:t>
+      </w:r>
+      <w:r>
+        <w:rPr>
+          <w:rFonts w:ascii="Tiro Devanagari Sanskrit" w:cs="Tiro Devanagari Sanskrit" w:eastAsia="Tiro Devanagari Sanskrit" w:hAnsi="Tiro Devanagari Sanskrit"/>
+          <w:i w:val="1"/>
+          <w:iCs w:val="1"/>
+          <w:sz w:val="24"/>
+          <w:szCs w:val="24"/>
+          <w:rtl w:val="0"/>
+        </w:rPr>
+        <w:t xml:space="preserve">pratyāsattir</w:t>
+      </w:r>
+      <w:r>
+        <w:rPr>
+          <w:rFonts w:ascii="Tiro Devanagari Sanskrit" w:cs="Tiro Devanagari Sanskrit" w:eastAsia="Tiro Devanagari Sanskrit" w:hAnsi="Tiro Devanagari Sanskrit"/>
+          <w:i w:val="1"/>
+          <w:iCs w:val="1"/>
+          <w:sz w:val="24"/>
+          <w:szCs w:val="24"/>
+          <w:rtl w:val="0"/>
+        </w:rPr>
+        <w:t xml:space="preserve"> āsīt</w:t>
       </w:r>
       <w:r>
         <w:rPr>
@@ -616,7 +683,7 @@
           <w:szCs w:val="24"/>
           <w:rtl w:val="0"/>
         </w:rPr>
-        <w:t xml:space="preserve">tasmin vane nāsyāḥ pratyasattir āsīt </w:t>
+        <w:t xml:space="preserve">tasmin vane nāsyāḥ pratyāsattir āsīt </w:t>
       </w:r>
       <w:r>
         <w:rPr>

</xml_diff>